<commit_message>
Create Mongo Spring Boot
</commit_message>
<xml_diff>
--- a/module3/Hướng dẫn MongoDB.docx
+++ b/module3/Hướng dẫn MongoDB.docx
@@ -1461,6 +1461,14 @@
         </w:rPr>
         <w:t>Hãy tạo document là thông báo của 1 tài khoản</w:t>
       </w:r>
+      <w:r>
+        <w:rPr>
+          <w:rFonts w:ascii="Times New Roman" w:hAnsi="Times New Roman" w:cs="Times New Roman"/>
+          <w:sz w:val="28"/>
+          <w:szCs w:val="28"/>
+        </w:rPr>
+        <w:t xml:space="preserve"> (Notification)</w:t>
+      </w:r>
     </w:p>
     <w:p>
       <w:pPr>
@@ -1947,15 +1955,7 @@
           <w:sz w:val="28"/>
           <w:szCs w:val="28"/>
         </w:rPr>
-        <w:t xml:space="preserve">  "accountId": "user</w:t>
-      </w:r>
-      <w:r>
-        <w:rPr>
-          <w:rFonts w:ascii="Times New Roman" w:hAnsi="Times New Roman" w:cs="Times New Roman"/>
-          <w:sz w:val="28"/>
-          <w:szCs w:val="28"/>
-        </w:rPr>
-        <w:t>2</w:t>
+        <w:t xml:space="preserve">  "accountId": "user2</w:t>
       </w:r>
       <w:r>
         <w:rPr>
@@ -4025,8 +4025,6 @@
           <w:szCs w:val="28"/>
         </w:rPr>
       </w:pPr>
-      <w:bookmarkStart w:id="0" w:name="_GoBack"/>
-      <w:bookmarkEnd w:id="0"/>
       <w:r>
         <w:rPr>
           <w:rFonts w:ascii="Times New Roman" w:hAnsi="Times New Roman" w:cs="Times New Roman"/>
@@ -4138,9 +4136,9 @@
         <w:lastRenderedPageBreak/>
         <w:drawing>
           <wp:inline distT="0" distB="0" distL="0" distR="0">
-            <wp:extent cx="5052060" cy="1005840"/>
-            <wp:effectExtent l="0" t="0" r="0" b="3810"/>
-            <wp:docPr id="21" name="Picture 21"/>
+            <wp:extent cx="6637020" cy="1531620"/>
+            <wp:effectExtent l="0" t="0" r="0" b="0"/>
+            <wp:docPr id="20" name="Picture 20"/>
             <wp:cNvGraphicFramePr>
               <a:graphicFrameLocks xmlns:a="http://schemas.openxmlformats.org/drawingml/2006/main" noChangeAspect="1"/>
             </wp:cNvGraphicFramePr>
@@ -4148,7 +4146,7 @@
               <a:graphicData uri="http://schemas.openxmlformats.org/drawingml/2006/picture">
                 <pic:pic xmlns:pic="http://schemas.openxmlformats.org/drawingml/2006/picture">
                   <pic:nvPicPr>
-                    <pic:cNvPr id="0" name="Picture 12"/>
+                    <pic:cNvPr id="0" name="Picture 1"/>
                     <pic:cNvPicPr>
                       <a:picLocks noChangeAspect="1" noChangeArrowheads="1"/>
                     </pic:cNvPicPr>
@@ -4169,7 +4167,7 @@
                   <pic:spPr bwMode="auto">
                     <a:xfrm>
                       <a:off x="0" y="0"/>
-                      <a:ext cx="5052060" cy="1005840"/>
+                      <a:ext cx="6637020" cy="1531620"/>
                     </a:xfrm>
                     <a:prstGeom prst="rect">
                       <a:avLst/>
@@ -4185,6 +4183,8 @@
           </wp:inline>
         </w:drawing>
       </w:r>
+      <w:bookmarkStart w:id="0" w:name="_GoBack"/>
+      <w:bookmarkEnd w:id="0"/>
     </w:p>
     <w:p>
       <w:pPr>
@@ -4847,7 +4847,6 @@
           <w:sz w:val="28"/>
           <w:szCs w:val="28"/>
         </w:rPr>
-        <w:lastRenderedPageBreak/>
         <w:t xml:space="preserve">    public Object debug() {</w:t>
       </w:r>
     </w:p>

</xml_diff>